<commit_message>
Update admin user manual
</commit_message>
<xml_diff>
--- a/VYVA_Admin_Console_User_Manual.docx
+++ b/VYVA_Admin_Console_User_Manual.docx
@@ -9835,6 +9835,228 @@
     <w:p>
       <w:r>
         <w:t>This same-day update documents the new feature immediately. Refresh screenshots during the next scheduled manual capture pass with sanitized demo data.</w:t>
+      </w:r>
+    </w:p>
+    <w:p>
+      <w:r>
+        <w:br w:type="page"/>
+      </w:r>
+    </w:p>
+    <w:p>
+      <w:pPr>
+        <w:jc w:val="center"/>
+      </w:pPr>
+      <w:r>
+        <w:rPr>
+          <w:b/>
+          <w:color w:val="1C1F35"/>
+          <w:sz w:val="44"/>
+        </w:rPr>
+        <w:t>Latest console updates</w:t>
+      </w:r>
+    </w:p>
+    <w:p>
+      <w:pPr>
+        <w:jc w:val="center"/>
+      </w:pPr>
+      <w:r>
+        <w:t>Manual addendum | Updated 2026-06-20</w:t>
+      </w:r>
+    </w:p>
+    <w:p>
+      <w:r>
+        <w:t>This addendum brings the manual up to date with the latest VYVA x Red Cross admin console changes. It should be read alongside the existing workflow sections until the next full screenshot refresh.</w:t>
+      </w:r>
+    </w:p>
+    <w:p>
+      <w:r>
+        <w:t>Public manual link: https://rcadmin.vyva.life/manuals/VYVA_Admin_Console_User_Manual.pdf</w:t>
+      </w:r>
+    </w:p>
+    <w:p>
+      <w:pPr>
+        <w:pStyle w:val="Heading2"/>
+      </w:pPr>
+      <w:r>
+        <w:t>Email-only admin access</w:t>
+      </w:r>
+    </w:p>
+    <w:p>
+      <w:r>
+        <w:t>Admins now enter one email address and receive a magic link. Google and Microsoft buttons are hidden. Organization access is resolved after sign-in from backend role records.</w:t>
+      </w:r>
+    </w:p>
+    <w:p>
+      <w:pPr>
+        <w:pStyle w:val="Heading2"/>
+      </w:pPr>
+      <w:r>
+        <w:t>Organization-aware console</w:t>
+      </w:r>
+    </w:p>
+    <w:p>
+      <w:r>
+        <w:t>The active organization must scope Clients, Risk, Check-ins, Brain Coach, Campaigns, Emergency Contacts, staff assignments, Settings, Reports, and dashboard metrics. Zamora defaults to Spanish/Spain/Madrid; Leipzig defaults to German/Germany/Berlin.</w:t>
+      </w:r>
+    </w:p>
+    <w:p>
+      <w:pPr>
+        <w:pStyle w:val="Heading2"/>
+      </w:pPr>
+      <w:r>
+        <w:t>Clients workflow</w:t>
+      </w:r>
+    </w:p>
+    <w:p>
+      <w:r>
+        <w:t>Care recipients are called Clients. Admins can Add client, Import clients by CSV, or use API intake for external onboarding. Team access remains only for staff accounts.</w:t>
+      </w:r>
+    </w:p>
+    <w:p>
+      <w:pPr>
+        <w:pStyle w:val="Heading2"/>
+      </w:pPr>
+      <w:r>
+        <w:t>Client profile</w:t>
+      </w:r>
+    </w:p>
+    <w:p>
+      <w:r>
+        <w:t>Profiles show key data, care coverage, health/care details, medication and routines, and an activity timeline. Call, WhatsApp, and contact-provider actions explain that a gateway is required until integrations are connected.</w:t>
+      </w:r>
+    </w:p>
+    <w:p>
+      <w:pPr>
+        <w:pStyle w:val="Heading2"/>
+      </w:pPr>
+      <w:r>
+        <w:t>Emergency contacts vs Red Cross staff</w:t>
+      </w:r>
+    </w:p>
+    <w:p>
+      <w:r>
+        <w:t>Emergency contacts are personal support contacts captured during onboarding, inbound calls, or admin intake. Red Cross staff are professional staff and are assigned separately with role-based wording.</w:t>
+      </w:r>
+    </w:p>
+    <w:p>
+      <w:pPr>
+        <w:pStyle w:val="Heading2"/>
+      </w:pPr>
+      <w:r>
+        <w:t>Check-ins</w:t>
+      </w:r>
+    </w:p>
+    <w:p>
+      <w:r>
+        <w:t>Check-ins is for check-up calls only. The page shows weekly schedule context, preferred time, and recorded last status such as scheduled, missed, successful, escalated, or awaiting first contact.</w:t>
+      </w:r>
+    </w:p>
+    <w:p>
+      <w:pPr>
+        <w:pStyle w:val="Heading2"/>
+      </w:pPr>
+      <w:r>
+        <w:t>Brain Coach</w:t>
+      </w:r>
+    </w:p>
+    <w:p>
+      <w:r>
+        <w:t>Brain Coach now has its own sessions page and report view. Opening the report action should show Brain Coach activity history, not the client profile.</w:t>
+      </w:r>
+    </w:p>
+    <w:p>
+      <w:pPr>
+        <w:pStyle w:val="Heading2"/>
+      </w:pPr>
+      <w:r>
+        <w:t>Medication adherence</w:t>
+      </w:r>
+    </w:p>
+    <w:p>
+      <w:r>
+        <w:t>Medication plans include name, dosage, purpose, schedule times, frequency, and reminder status. The adherence calendar shows Taken, Missed, Unconfirmed, and Upcoming states per client.</w:t>
+      </w:r>
+    </w:p>
+    <w:p>
+      <w:pPr>
+        <w:pStyle w:val="Heading2"/>
+      </w:pPr>
+      <w:r>
+        <w:t>Risk and Sensors</w:t>
+      </w:r>
+    </w:p>
+    <w:p>
+      <w:r>
+        <w:t>Risk replaces Risk Queue and should explain metric logic through help affordances. Alerts is now Sensors; empty states should be clear when the sensor backend is not connected.</w:t>
+      </w:r>
+    </w:p>
+    <w:p>
+      <w:pPr>
+        <w:pStyle w:val="Heading2"/>
+      </w:pPr>
+      <w:r>
+        <w:t>VYVA Call Campaigns</w:t>
+      </w:r>
+    </w:p>
+    <w:p>
+      <w:r>
+        <w:t>Campaigns is call-first. Admins choose a template or custom campaign, use AI assist for scripts, build smart targets, preview recipients, then save, schedule, or queue. Real calls remain behind the voice connector guard.</w:t>
+      </w:r>
+    </w:p>
+    <w:p>
+      <w:pPr>
+        <w:pStyle w:val="Heading2"/>
+      </w:pPr>
+      <w:r>
+        <w:t>Admin checklist</w:t>
+      </w:r>
+    </w:p>
+    <w:p>
+      <w:pPr>
+        <w:pStyle w:val="ListBullet"/>
+      </w:pPr>
+      <w:r>
+        <w:t>Confirm the active organization before reviewing or editing records.</w:t>
+      </w:r>
+    </w:p>
+    <w:p>
+      <w:pPr>
+        <w:pStyle w:val="ListBullet"/>
+      </w:pPr>
+      <w:r>
+        <w:t>Use Clients for care-recipient profiles and Team access for staff accounts.</w:t>
+      </w:r>
+    </w:p>
+    <w:p>
+      <w:pPr>
+        <w:pStyle w:val="ListBullet"/>
+      </w:pPr>
+      <w:r>
+        <w:t>Keep emergency contacts separate from Red Cross staff.</w:t>
+      </w:r>
+    </w:p>
+    <w:p>
+      <w:pPr>
+        <w:pStyle w:val="ListBullet"/>
+      </w:pPr>
+      <w:r>
+        <w:t>Check consent and phone availability before scheduling routine calls or campaigns.</w:t>
+      </w:r>
+    </w:p>
+    <w:p>
+      <w:pPr>
+        <w:pStyle w:val="ListBullet"/>
+      </w:pPr>
+      <w:r>
+        <w:t>Preview campaign recipients before queueing or scheduling calls.</w:t>
+      </w:r>
+    </w:p>
+    <w:p>
+      <w:pPr>
+        <w:pStyle w:val="ListBullet"/>
+      </w:pPr>
+      <w:r>
+        <w:t>Treat call, WhatsApp, and provider contact buttons as gateway-required until connectors are configured.</w:t>
       </w:r>
     </w:p>
     <w:sectPr>

</xml_diff>